<commit_message>
Utiliser une seule période de formation pour les parcours AFC
Supprime les périodes APS et SSIAP 1 distinctes dans les formulaires, les fiches et l’espace stagiaire. Conserve la période globale, les deux examens et les dates individuelles. Adapte les convocations et conventions et ignore les anciens champs de périodes séparées.

Validation : 79 tests ciblés réussis ; formulaires et enregistrement vérifiés dans Chromium sur ordinateur et mobile ; modèles Word rendus et contrôlés en PDF.
</commit_message>
<xml_diff>
--- a/templates_word/convocationafc.docx
+++ b/templates_word/convocationafc.docx
@@ -593,7 +593,7 @@
         <w:br/>
         <w:t>Présentez-vous le {{ date_convocation }} à {{ heure_convocation }} au centre de formation.</w:t>
         <w:br/>
-        <w:t xml:space="preserve">Le calendrier commun aux deux formations est précisé ci-dessous : </w:t>
+        <w:t xml:space="preserve">APS et SSIAP 1 sont inclus dans cette période de formation : </w:t>
       </w:r>
     </w:p>
     <w:tbl>
@@ -643,7 +643,7 @@
                 <w:sz w:val="20"/>
                 <w:szCs w:val="20"/>
               </w:rPr>
-              <w:t>Formation</w:t>
+              <w:t>Parcours</w:t>
             </w:r>
           </w:p>
         </w:tc>
@@ -677,7 +677,7 @@
                 <w:sz w:val="20"/>
                 <w:szCs w:val="20"/>
               </w:rPr>
-              <w:t>Calendrier de la session</w:t>
+              <w:t>Début de formation</w:t>
             </w:r>
           </w:p>
         </w:tc>
@@ -711,7 +711,7 @@
                 <w:sz w:val="20"/>
                 <w:szCs w:val="20"/>
               </w:rPr>
-              <w:t>Examen</w:t>
+              <w:t>Fin de formation</w:t>
             </w:r>
           </w:p>
         </w:tc>
@@ -787,7 +787,7 @@
                 <w:sz w:val="20"/>
                 <w:szCs w:val="20"/>
               </w:rPr>
-              <w:t>APS</w:t>
+              <w:t>AFC APS + SSIAP 1</w:t>
             </w:r>
           </w:p>
         </w:tc>
@@ -824,7 +824,7 @@
                 <w:szCs w:val="20"/>
                 <w:lang w:val="fr-FR"/>
               </w:rPr>
-              <w:t>{{ periode_aps }}</w:t>
+              <w:t>{{ date_debut_formation }}</w:t>
             </w:r>
             <w:r>
               <w:rPr>
@@ -874,176 +874,7 @@
               <w:rPr>
                 <w:sz w:val="20"/>
               </w:rPr>
-              <w:t>{{ date_examen_aps }}</w:t>
-            </w:r>
-          </w:p>
-        </w:tc>
-        <w:tc>
-          <w:tcPr>
-            <w:tcW w:w="3168" w:type="dxa"/>
-            <w:tcBorders>
-              <w:top w:val="single" w:sz="5" w:space="0" w:color="D9DEE8"/>
-              <w:left w:val="single" w:sz="5" w:space="0" w:color="D9DEE8"/>
-              <w:bottom w:val="single" w:sz="5" w:space="0" w:color="D9DEE8"/>
-              <w:right w:val="single" w:sz="5" w:space="0" w:color="D9DEE8"/>
-            </w:tcBorders>
-            <w:tcMar>
-              <w:top w:w="100" w:type="dxa"/>
-              <w:left w:w="80" w:type="dxa"/>
-              <w:bottom w:w="100" w:type="dxa"/>
-              <w:right w:w="80" w:type="dxa"/>
-            </w:tcMar>
-            <w:vAlign w:val="center"/>
-          </w:tcPr>
-          <w:p>
-            <w:pPr>
-              <w:spacing w:after="0"/>
-              <w:jc w:val="center"/>
-              <w:rPr>
-                <w:rFonts w:cs="Arial"/>
-                <w:szCs w:val="20"/>
-              </w:rPr>
-            </w:pPr>
-            <w:r>
-              <w:rPr>
-                <w:rFonts w:cs="Arial"/>
-                <w:sz w:val="20"/>
-                <w:szCs w:val="20"/>
-              </w:rPr>
-              <w:t>Intégrale Academy</w:t>
-              <w:br/>
-              <w:t>54 chemin du Carreou</w:t>
-              <w:br/>
-              <w:t>83480 PUGET SUR ARGENS</w:t>
-            </w:r>
-          </w:p>
-        </w:tc>
-      </w:tr>
-      <w:tr>
-        <w:trPr>
-          <w:jc w:val="center"/>
-        </w:trPr>
-        <w:tc>
-          <w:tcPr>
-            <w:tcW w:w="3168" w:type="dxa"/>
-            <w:tcBorders>
-              <w:top w:val="single" w:sz="5" w:space="0" w:color="D9DEE8"/>
-              <w:left w:val="single" w:sz="5" w:space="0" w:color="D9DEE8"/>
-              <w:bottom w:val="single" w:sz="5" w:space="0" w:color="D9DEE8"/>
-              <w:right w:val="single" w:sz="5" w:space="0" w:color="D9DEE8"/>
-            </w:tcBorders>
-            <w:tcMar>
-              <w:top w:w="100" w:type="dxa"/>
-              <w:left w:w="80" w:type="dxa"/>
-              <w:bottom w:w="100" w:type="dxa"/>
-              <w:right w:w="80" w:type="dxa"/>
-            </w:tcMar>
-            <w:vAlign w:val="center"/>
-          </w:tcPr>
-          <w:p>
-            <w:pPr>
-              <w:spacing w:after="0"/>
-              <w:jc w:val="center"/>
-              <w:rPr>
-                <w:szCs w:val="20"/>
-              </w:rPr>
-            </w:pPr>
-            <w:r>
-              <w:rPr>
-                <w:rFonts w:cs="Arial"/>
-                <w:b/>
-                <w:bCs/>
-                <w:sz w:val="20"/>
-                <w:szCs w:val="20"/>
-              </w:rPr>
-              <w:t>SSIAP 1</w:t>
-            </w:r>
-          </w:p>
-        </w:tc>
-        <w:tc>
-          <w:tcPr>
-            <w:tcW w:w="2304" w:type="dxa"/>
-            <w:tcBorders>
-              <w:top w:val="single" w:sz="5" w:space="0" w:color="D9DEE8"/>
-              <w:left w:val="single" w:sz="5" w:space="0" w:color="D9DEE8"/>
-              <w:bottom w:val="single" w:sz="5" w:space="0" w:color="D9DEE8"/>
-              <w:right w:val="single" w:sz="5" w:space="0" w:color="D9DEE8"/>
-            </w:tcBorders>
-            <w:tcMar>
-              <w:top w:w="100" w:type="dxa"/>
-              <w:left w:w="80" w:type="dxa"/>
-              <w:bottom w:w="100" w:type="dxa"/>
-              <w:right w:w="80" w:type="dxa"/>
-            </w:tcMar>
-            <w:vAlign w:val="center"/>
-          </w:tcPr>
-          <w:p>
-            <w:pPr>
-              <w:spacing w:after="0"/>
-              <w:jc w:val="center"/>
-              <w:rPr>
-                <w:szCs w:val="20"/>
-              </w:rPr>
-            </w:pPr>
-            <w:r>
-              <w:rPr>
-                <w:rFonts w:eastAsiaTheme="minorEastAsia" w:cs="Arial"/>
-                <w:color w:val="auto"/>
-                <w:sz w:val="20"/>
-                <w:szCs w:val="20"/>
-                <w:lang w:val="fr-FR"/>
-              </w:rPr>
-              <w:t>{{ periode_ssiap }}</w:t>
-            </w:r>
-            <w:r>
-              <w:rPr>
-                <w:rFonts w:eastAsiaTheme="minorEastAsia" w:cs="Arial"/>
-                <w:color w:val="auto"/>
-                <w:sz w:val="20"/>
-                <w:szCs w:val="20"/>
-                <w:lang w:val="fr-FR"/>
-              </w:rPr>
-            </w:r>
-            <w:r>
-              <w:rPr>
-                <w:sz w:val="20"/>
-                <w:szCs w:val="20"/>
-              </w:rPr>
-            </w:r>
-            <w:r>
-              <w:rPr>
-                <w:sz w:val="20"/>
-                <w:szCs w:val="20"/>
-              </w:rPr>
-            </w:r>
-          </w:p>
-        </w:tc>
-        <w:tc>
-          <w:tcPr>
-            <w:tcW w:w="1584" w:type="dxa"/>
-            <w:tcBorders>
-              <w:top w:val="single" w:sz="5" w:space="0" w:color="D9DEE8"/>
-              <w:left w:val="single" w:sz="5" w:space="0" w:color="D9DEE8"/>
-              <w:bottom w:val="single" w:sz="5" w:space="0" w:color="D9DEE8"/>
-              <w:right w:val="single" w:sz="5" w:space="0" w:color="D9DEE8"/>
-            </w:tcBorders>
-            <w:tcMar>
-              <w:top w:w="100" w:type="dxa"/>
-              <w:left w:w="80" w:type="dxa"/>
-              <w:bottom w:w="100" w:type="dxa"/>
-              <w:right w:w="80" w:type="dxa"/>
-            </w:tcMar>
-            <w:vAlign w:val="center"/>
-          </w:tcPr>
-          <w:p>
-            <w:pPr>
-              <w:jc w:val="center"/>
-            </w:pPr>
-            <w:r>
-              <w:rPr>
-                <w:sz w:val="20"/>
-              </w:rPr>
-              <w:t>{{ date_examen_ssiap }}</w:t>
+              <w:t>{{ date_fin_formation }}</w:t>
             </w:r>
           </w:p>
         </w:tc>

</xml_diff>

<commit_message>
Adapter les documents AFC et A3P et ajouter les questionnaires de fin d’UV
AFC : quatre documents dédiés au parcours France Travail sans reste à charge et espace stagiaire adapté.
A3P initial : attestations conducteur d’autorité et STU jointes à l’attestation de fin.
APS/A3P : 23 questionnaires de 20 questions, accès au début du présentiel, corrections après remise et exports PDF administratifs.

Validation : 58 tests ciblés réussis et contrôle visuel des documents générés.
</commit_message>
<xml_diff>
--- a/templates_word/convocationafc.docx
+++ b/templates_word/convocationafc.docx
@@ -12,7 +12,7 @@
           <w:b/>
           <w:sz w:val="34"/>
         </w:rPr>
-        <w:t>CONVOCATION AFC APS + SSIAP 1</w:t>
+        <w:t>CONVOCATION AFC APS + SSIAP 1 + SST + Habilitation électrique</w:t>
       </w:r>
     </w:p>
     <w:p>
@@ -24,7 +24,7 @@
         <w:rPr>
           <w:i/>
         </w:rPr>
-        <w:t>Agent de prévention et de sécurité + Agent de sécurité incendie</w:t>
+        <w:t>Sécurité privée · Sécurité incendie · Secourisme · Risque électrique</w:t>
       </w:r>
     </w:p>
     <w:p>
@@ -391,7 +391,7 @@
           <w:b/>
           <w:color w:val="B98417"/>
         </w:rPr>
-        <w:t>Document officiel de convocation en formation AFC APS + SSIAP 1</w:t>
+        <w:t>Document officiel de convocation en formation AFC APS + SSIAP 1 + SST + Habilitation électrique</w:t>
       </w:r>
     </w:p>
     <w:p>
@@ -415,7 +415,7 @@
           <w:b/>
           <w:color w:val="B98417"/>
         </w:rPr>
-        <w:t>FORMATION AFC APS + SSIAP 1</w:t>
+        <w:t>FORMATION AFC APS + SSIAP 1 + SST + Habilitation électrique</w:t>
       </w:r>
     </w:p>
     <w:p>
@@ -593,7 +593,9 @@
         <w:br/>
         <w:t>Présentez-vous le {{ date_convocation }} à {{ heure_convocation }} au centre de formation.</w:t>
         <w:br/>
-        <w:t xml:space="preserve">APS et SSIAP 1 sont inclus dans cette période de formation : </w:t>
+        <w:t xml:space="preserve">Le parcours comprend APS, SSIAP 1, SST et formation à l’habilitation électrique : </w:t>
+        <w:br/>
+        <w:t>Durée individuelle : {{ afc_total_duration }}. RAN : {{ afc_ran_duration }}.</w:t>
       </w:r>
     </w:p>
     <w:tbl>
@@ -787,7 +789,7 @@
                 <w:sz w:val="20"/>
                 <w:szCs w:val="20"/>
               </w:rPr>
-              <w:t>AFC APS + SSIAP 1</w:t>
+              <w:t>AFC APS + SSIAP 1 + SST + Habilitation électrique</w:t>
             </w:r>
           </w:p>
         </w:tc>
@@ -957,7 +959,6 @@
           <w:color w:val="FFFFFF"/>
           <w:szCs w:val="20"/>
         </w:rPr>
-        <w:t>[:AFs]</w:t>
       </w:r>
       <w:r>
         <w:rPr>
@@ -971,7 +972,7 @@
     <w:p>
       <w:pPr>
         <w:spacing w:before="160" w:after="120"/>
-        <w:jc w:val="both"/>
+        <w:jc w:val="left"/>
         <w:rPr>
           <w:rFonts w:cs="Arial"/>
           <w:b/>
@@ -986,6 +987,9 @@
           <w:bCs/>
           <w:szCs w:val="20"/>
         </w:rPr>
+        <w:t>Financement : marché France Travail - AFC (Action de formation conventionnée). Aucun frais de formation n’est dû par le stagiaire : reste à charge de 0 €.</w:t>
+        <w:br/>
+        <w:br/>
         <w:t>En cas d’indisponibilité ou de renoncement, nous vous remercions de bien vouloir nous avertir dès que possible par téléphone au 04 22 47 07 68 ou par email à ecole@integraleacademy.com.</w:t>
       </w:r>
     </w:p>
@@ -1300,7 +1304,7 @@
         <w:rPr>
           <w:i/>
         </w:rPr>
-        <w:t>APS + SSIAP 1</w:t>
+        <w:t>APS + SSIAP 1 + SST + Habilitation électrique</w:t>
       </w:r>
     </w:p>
     <w:tbl>
@@ -1426,7 +1430,7 @@
         </w:rPr>
       </w:pPr>
       <w:r>
-        <w:t>Les deux examens de votre parcours AFC sont organisés aux dates suivantes. Les horaires et consignes propres à chaque épreuve vous sont communiqués par le centre.</w:t>
+        <w:t>Les deux examens de votre parcours AFC sont organisés aux dates suivantes. Les horaires et consignes propres à chaque épreuve vous sont communiqués par le centre. Les séances et évaluations SST et d’habilitation électrique sont organisées selon le planning individuel remis par le centre.</w:t>
       </w:r>
     </w:p>
     <w:tbl>
@@ -1919,7 +1923,6 @@
           <w:color w:val="FFFFFF"/>
           <w:szCs w:val="20"/>
         </w:rPr>
-        <w:t>[:AFs]</w:t>
       </w:r>
       <w:r>
         <w:rPr>
@@ -2359,7 +2362,7 @@
         </w:rPr>
       </w:pPr>
       <w:r>
-        <w:t>La liste complète des documents à fournir est indiquée directement dans votre espace stagiaire. À titre d’exemple, il peut notamment s’agir de votre pièce d’identité, de votre carte vitale, d’une photo d’identité, de votre certificat de secourisme en cours de validité, du certificat médical d’aptitude ou de tout autre document nécessaire à la constitution de votre dossier.</w:t>
+        <w:t>La liste complète des documents à fournir est indiquée directement dans votre espace stagiaire. À titre d’exemple, il peut notamment s’agir de votre pièce d’identité, de votre carte vitale, d’une photo d’identité, de votre autorisation CNAPS, de votre justificatif de secourisme si vous en possédez un, du certificat médical d’aptitude ou de tout autre document nécessaire à la constitution de votre dossier.</w:t>
       </w:r>
     </w:p>
     <w:tbl>
@@ -2551,7 +2554,7 @@
                 <w:b/>
                 <w:szCs w:val="20"/>
               </w:rPr>
-              <w:t>En cas de documents manquants, non conformes, illisibles ou non transmis dans les délais, l’accès à la formation pourra être refusé. Dans ce cas, aucune demande de remboursement ne pourra être acceptée, le refus d’accès étant lié au non-respect des obligations administratives préalables à l’entrée en formation.</w:t>
+              <w:t>En cas de documents manquants, non conformes ou transmis hors délai, contactez immédiatement le centre. L’entrée en formation ou l’accès aux épreuves peut être reporté ou refusé si les prérequis ne sont pas réunis. La situation sera examinée avec France Travail, sans facturation de frais pédagogiques au stagiaire.</w:t>
             </w:r>
           </w:p>
         </w:tc>

</xml_diff>